<commit_message>
chore(release): preserve installer revision and manual updates
Support the Windows installer revision independently of the package semantic
version and generate a valid four-part assembly version. Include the pending
user manual and README updates.
</commit_message>
<xml_diff>
--- a/manual-usuario/VapeSociety_Manual_de_Usuario_v0.1.6.docx
+++ b/manual-usuario/VapeSociety_Manual_de_Usuario_v0.1.6.docx
@@ -8,7 +8,7 @@
           <w:noProof/>
         </w:rPr>
         <w:drawing>
-          <wp:inline distT="0" distB="0" distL="0" distR="0" wp14:anchorId="1F71E602" wp14:editId="6F919146">
+          <wp:inline distT="0" distB="0" distL="0" distR="0" wp14:anchorId="1158290E" wp14:editId="7E2BCB7C">
             <wp:extent cx="1188720" cy="992187"/>
             <wp:effectExtent l="0" t="0" r="0" b="0"/>
             <wp:docPr id="1" name="Picture 1"/>
@@ -62,7 +62,7 @@
     </w:p>
     <w:p>
       <w:r>
-        <w:t>Versión 0.1.6  |  Actualizado el 18 de octubre de 2026</w:t>
+        <w:t>Versión 0.1.6  |  Actualizado el 19 de octubre de 2026</w:t>
       </w:r>
     </w:p>
     <w:p>
@@ -83,7 +83,7 @@
           <w:noProof/>
         </w:rPr>
         <w:drawing>
-          <wp:inline distT="0" distB="0" distL="0" distR="0" wp14:anchorId="3E7F0D43" wp14:editId="2B2C8D4C">
+          <wp:inline distT="0" distB="0" distL="0" distR="0" wp14:anchorId="712A463C" wp14:editId="7DD5651A">
             <wp:extent cx="6126480" cy="3103164"/>
             <wp:effectExtent l="0" t="0" r="0" b="0"/>
             <wp:docPr id="2" name="Picture 2" descr="Pantalla inicial con operaciones ficticias para los ejemplos del manual."/>
@@ -1452,7 +1452,7 @@
     </w:p>
     <w:p>
       <w:r>
-        <w:t>Prepará el negocio antes de registrar las operaciones. Las capturas de esta edición muestran ejemplos ficticios y la interfaz de la versión 0.1.6 actualizada al 18 de octubre de 2026.</w:t>
+        <w:t>Prepará el negocio antes de registrar las operaciones. Las capturas de esta edición muestran ejemplos ficticios y la interfaz de la versión 0.1.6 actualizada al 19 de octubre de 2026.</w:t>
       </w:r>
     </w:p>
     <w:p>
@@ -1465,7 +1465,7 @@
           <w:noProof/>
         </w:rPr>
         <w:drawing>
-          <wp:inline distT="0" distB="0" distL="0" distR="0" wp14:anchorId="67355ACC" wp14:editId="04E93B2D">
+          <wp:inline distT="0" distB="0" distL="0" distR="0" wp14:anchorId="7E9499A4" wp14:editId="25D72AE1">
             <wp:extent cx="6309360" cy="3363995"/>
             <wp:effectExtent l="0" t="0" r="0" b="0"/>
             <wp:docPr id="3" name="Picture 3" descr="Configuración inicial con datos ficticios."/>
@@ -1679,7 +1679,7 @@
           <w:noProof/>
         </w:rPr>
         <w:drawing>
-          <wp:inline distT="0" distB="0" distL="0" distR="0" wp14:anchorId="028FD284" wp14:editId="628BC906">
+          <wp:inline distT="0" distB="0" distL="0" distR="0" wp14:anchorId="4A94CEC8" wp14:editId="49CDAEB7">
             <wp:extent cx="6309360" cy="3195795"/>
             <wp:effectExtent l="0" t="0" r="0" b="0"/>
             <wp:docPr id="4" name="Picture 4" descr="Dashboard con datos ficticios."/>
@@ -1874,7 +1874,7 @@
           <w:noProof/>
         </w:rPr>
         <w:drawing>
-          <wp:inline distT="0" distB="0" distL="0" distR="0" wp14:anchorId="27ABD86E" wp14:editId="069AB800">
+          <wp:inline distT="0" distB="0" distL="0" distR="0" wp14:anchorId="72B47712" wp14:editId="1048F084">
             <wp:extent cx="6309360" cy="3195795"/>
             <wp:effectExtent l="0" t="0" r="0" b="0"/>
             <wp:docPr id="5" name="Picture 5" descr="Productos con datos ficticios."/>
@@ -2129,7 +2129,7 @@
           <w:noProof/>
         </w:rPr>
         <w:drawing>
-          <wp:inline distT="0" distB="0" distL="0" distR="0" wp14:anchorId="789188C6" wp14:editId="02391DA7">
+          <wp:inline distT="0" distB="0" distL="0" distR="0" wp14:anchorId="593FBEE9" wp14:editId="7D8BCB01">
             <wp:extent cx="6309360" cy="3195795"/>
             <wp:effectExtent l="0" t="0" r="0" b="0"/>
             <wp:docPr id="6" name="Picture 6" descr="Listado de combos y sus componentes."/>
@@ -2390,7 +2390,7 @@
           <w:noProof/>
         </w:rPr>
         <w:drawing>
-          <wp:inline distT="0" distB="0" distL="0" distR="0" wp14:anchorId="64333DBF" wp14:editId="1CD4BD6E">
+          <wp:inline distT="0" distB="0" distL="0" distR="0" wp14:anchorId="76F7E7CF" wp14:editId="1F84F98C">
             <wp:extent cx="6309360" cy="3728258"/>
             <wp:effectExtent l="0" t="0" r="0" b="0"/>
             <wp:docPr id="7" name="Picture 7" descr="Listas de precios con datos ficticios."/>
@@ -2556,7 +2556,7 @@
           <w:noProof/>
         </w:rPr>
         <w:drawing>
-          <wp:inline distT="0" distB="0" distL="0" distR="0" wp14:anchorId="2873E4CD" wp14:editId="011D5D06">
+          <wp:inline distT="0" distB="0" distL="0" distR="0" wp14:anchorId="4B662163" wp14:editId="281BAF47">
             <wp:extent cx="5394960" cy="3060705"/>
             <wp:effectExtent l="0" t="0" r="0" b="0"/>
             <wp:docPr id="8" name="Picture 8" descr="Asignar listas a clientes con datos ficticios."/>
@@ -3048,7 +3048,7 @@
           <w:noProof/>
         </w:rPr>
         <w:drawing>
-          <wp:inline distT="0" distB="0" distL="0" distR="0" wp14:anchorId="5E866CC5" wp14:editId="6607A73E">
+          <wp:inline distT="0" distB="0" distL="0" distR="0" wp14:anchorId="4920083D" wp14:editId="6CE8F701">
             <wp:extent cx="6309360" cy="3195795"/>
             <wp:effectExtent l="0" t="0" r="0" b="0"/>
             <wp:docPr id="9" name="Picture 9" descr="Proveedores con datos ficticios."/>
@@ -3261,7 +3261,7 @@
           <w:noProof/>
         </w:rPr>
         <w:drawing>
-          <wp:inline distT="0" distB="0" distL="0" distR="0" wp14:anchorId="4EA7ED7C" wp14:editId="1B4E8078">
+          <wp:inline distT="0" distB="0" distL="0" distR="0" wp14:anchorId="4058E251" wp14:editId="2CEF0821">
             <wp:extent cx="5212080" cy="3031990"/>
             <wp:effectExtent l="0" t="0" r="0" b="0"/>
             <wp:docPr id="10" name="Picture 10" descr="Pagar y corregir deudas a proveedores con datos ficticios."/>
@@ -3429,7 +3429,7 @@
           <w:noProof/>
         </w:rPr>
         <w:drawing>
-          <wp:inline distT="0" distB="0" distL="0" distR="0" wp14:anchorId="2DA34DF1" wp14:editId="6CF1E1ED">
+          <wp:inline distT="0" distB="0" distL="0" distR="0" wp14:anchorId="6917B77F" wp14:editId="4DE7775A">
             <wp:extent cx="6309360" cy="3195795"/>
             <wp:effectExtent l="0" t="0" r="0" b="0"/>
             <wp:docPr id="11" name="Picture 11" descr="Compras con datos ficticios."/>
@@ -3630,7 +3630,7 @@
           <w:noProof/>
         </w:rPr>
         <w:drawing>
-          <wp:inline distT="0" distB="0" distL="0" distR="0" wp14:anchorId="167536F6" wp14:editId="29CA4A91">
+          <wp:inline distT="0" distB="0" distL="0" distR="0" wp14:anchorId="43DA86F8" wp14:editId="3178B8AD">
             <wp:extent cx="6309360" cy="3363995"/>
             <wp:effectExtent l="0" t="0" r="0" b="0"/>
             <wp:docPr id="12" name="Picture 12" descr="Nueva venta con datos ficticios."/>
@@ -3831,7 +3831,7 @@
           <w:noProof/>
         </w:rPr>
         <w:drawing>
-          <wp:inline distT="0" distB="0" distL="0" distR="0" wp14:anchorId="509B764A" wp14:editId="7715D803">
+          <wp:inline distT="0" distB="0" distL="0" distR="0" wp14:anchorId="7F51A3DA" wp14:editId="7A07EEAF">
             <wp:extent cx="4389120" cy="2663416"/>
             <wp:effectExtent l="0" t="0" r="0" b="0"/>
             <wp:docPr id="13" name="Picture 13" descr="Vender en cuotas directas con datos ficticios."/>
@@ -4002,7 +4002,7 @@
           <w:noProof/>
         </w:rPr>
         <w:drawing>
-          <wp:inline distT="0" distB="0" distL="0" distR="0" wp14:anchorId="1C0CD0D8" wp14:editId="32B4BBB9">
+          <wp:inline distT="0" distB="0" distL="0" distR="0" wp14:anchorId="1D5C9F98" wp14:editId="056352FA">
             <wp:extent cx="6309360" cy="3195795"/>
             <wp:effectExtent l="0" t="0" r="0" b="0"/>
             <wp:docPr id="14" name="Picture 14" descr="Clientes y cobranzas con datos ficticios."/>
@@ -4215,7 +4215,7 @@
           <w:noProof/>
         </w:rPr>
         <w:drawing>
-          <wp:inline distT="0" distB="0" distL="0" distR="0" wp14:anchorId="5A926619" wp14:editId="3D63A845">
+          <wp:inline distT="0" distB="0" distL="0" distR="0" wp14:anchorId="4E73029B" wp14:editId="2D37E095">
             <wp:extent cx="5029200" cy="3858381"/>
             <wp:effectExtent l="0" t="0" r="0" b="0"/>
             <wp:docPr id="15" name="Picture 15" descr="Cargar una deuda anterior de un cliente con datos ficticios."/>
@@ -4380,7 +4380,7 @@
           <w:noProof/>
         </w:rPr>
         <w:drawing>
-          <wp:inline distT="0" distB="0" distL="0" distR="0" wp14:anchorId="333B3B14" wp14:editId="02564A35">
+          <wp:inline distT="0" distB="0" distL="0" distR="0" wp14:anchorId="53AF79A9" wp14:editId="0DDB37D1">
             <wp:extent cx="4937760" cy="3773921"/>
             <wp:effectExtent l="0" t="0" r="0" b="0"/>
             <wp:docPr id="16" name="Picture 16" descr="Registrar un cobro de cliente con datos ficticios."/>
@@ -4605,7 +4605,7 @@
           <w:noProof/>
         </w:rPr>
         <w:drawing>
-          <wp:inline distT="0" distB="0" distL="0" distR="0" wp14:anchorId="436981DC" wp14:editId="41A7AE04">
+          <wp:inline distT="0" distB="0" distL="0" distR="0" wp14:anchorId="2DF90439" wp14:editId="4523DA7F">
             <wp:extent cx="6309360" cy="3195795"/>
             <wp:effectExtent l="0" t="0" r="0" b="0"/>
             <wp:docPr id="17" name="Picture 17" descr="Ventas con tarjeta y acreditaciones con datos ficticios."/>
@@ -4893,7 +4893,7 @@
           <w:noProof/>
         </w:rPr>
         <w:drawing>
-          <wp:inline distT="0" distB="0" distL="0" distR="0" wp14:anchorId="58CB98CF" wp14:editId="15B2105F">
+          <wp:inline distT="0" distB="0" distL="0" distR="0" wp14:anchorId="0B82012C" wp14:editId="1573AFF5">
             <wp:extent cx="6309360" cy="3195795"/>
             <wp:effectExtent l="0" t="0" r="0" b="0"/>
             <wp:docPr id="18" name="Picture 18" descr="Gestión de ventas con datos ficticios."/>
@@ -5073,8 +5073,8 @@
           <w:noProof/>
         </w:rPr>
         <w:drawing>
-          <wp:inline distT="0" distB="0" distL="0" distR="0" wp14:anchorId="6B2AD7D0" wp14:editId="65A63574">
-            <wp:extent cx="6309360" cy="3195795"/>
+          <wp:inline distT="0" distB="0" distL="0" distR="0" wp14:anchorId="1231FB9C" wp14:editId="228E4C97">
+            <wp:extent cx="6309360" cy="3061236"/>
             <wp:effectExtent l="0" t="0" r="0" b="0"/>
             <wp:docPr id="19" name="Picture 19" descr="Stock con datos ficticios."/>
             <wp:cNvGraphicFramePr>
@@ -5096,7 +5096,7 @@
                   <pic:spPr>
                     <a:xfrm>
                       <a:off x="0" y="0"/>
-                      <a:ext cx="6309360" cy="3195795"/>
+                      <a:ext cx="6309360" cy="3061236"/>
                     </a:xfrm>
                     <a:prstGeom prst="rect">
                       <a:avLst/>
@@ -5129,7 +5129,7 @@
         <w:rPr>
           <w:b/>
         </w:rPr>
-        <w:t>Pagado</w:t>
+        <w:t>Stock Propio</w:t>
       </w:r>
       <w:r>
         <w:t xml:space="preserve"> y </w:t>
@@ -5138,10 +5138,74 @@
         <w:rPr>
           <w:b/>
         </w:rPr>
+        <w:t>Stock a crédito</w:t>
+      </w:r>
+      <w:r>
+        <w:t xml:space="preserve"> muestran el valor al costo de la mercadería que queda, según esté pagada al proveedor o pendiente de pago.</w:t>
+      </w:r>
+    </w:p>
+    <w:p>
+      <w:pPr>
+        <w:pStyle w:val="ManualBullet"/>
+      </w:pPr>
+      <w:r>
+        <w:t xml:space="preserve">•  </w:t>
+      </w:r>
+      <w:r>
+        <w:rPr>
+          <w:b/>
+        </w:rPr>
+        <w:t>Valor Stock</w:t>
+      </w:r>
+      <w:r>
+        <w:t xml:space="preserve"> suma todo el stock físico, incluido el que figura </w:t>
+      </w:r>
+      <w:r>
+        <w:rPr>
+          <w:b/>
+        </w:rPr>
+        <w:t>con pago sin indicar</w:t>
+      </w:r>
+      <w:r>
+        <w:t>.</w:t>
+      </w:r>
+    </w:p>
+    <w:p>
+      <w:pPr>
+        <w:pStyle w:val="ManualBullet"/>
+      </w:pPr>
+      <w:r>
+        <w:t xml:space="preserve">•  En </w:t>
+      </w:r>
+      <w:r>
+        <w:rPr>
+          <w:b/>
+        </w:rPr>
+        <w:t>Inventario</w:t>
+      </w:r>
+      <w:r>
+        <w:t xml:space="preserve">, las columnas </w:t>
+      </w:r>
+      <w:r>
+        <w:rPr>
+          <w:b/>
+        </w:rPr>
+        <w:t>Propio</w:t>
+      </w:r>
+      <w:r>
+        <w:t xml:space="preserve"> y </w:t>
+      </w:r>
+      <w:r>
+        <w:rPr>
+          <w:b/>
+        </w:rPr>
         <w:t>A crédito</w:t>
       </w:r>
       <w:r>
-        <w:t xml:space="preserve"> muestran cantidades y valores según el estado de pago de la mercadería que aún existe.</w:t>
+        <w:t xml:space="preserve"> muestran un</w:t>
+      </w:r>
+      <w:r>
+        <w:t>idades y valores por producto.</w:t>
       </w:r>
     </w:p>
     <w:p>
@@ -5158,7 +5222,7 @@
         <w:t>Total físico</w:t>
       </w:r>
       <w:r>
-        <w:t xml:space="preserve"> incluye las unidades reservadas. </w:t>
+        <w:t xml:space="preserve"> incluye reservas; </w:t>
       </w:r>
       <w:r>
         <w:rPr>
@@ -5167,27 +5231,7 @@
         <w:t>Disponible</w:t>
       </w:r>
       <w:r>
-        <w:t xml:space="preserve"> descuenta las reservas de ventas pendientes.</w:t>
-      </w:r>
-    </w:p>
-    <w:p>
-      <w:pPr>
-        <w:pStyle w:val="ManualBullet"/>
-      </w:pPr>
-      <w:r>
-        <w:t xml:space="preserve">•  </w:t>
-      </w:r>
-      <w:r>
-        <w:rPr>
-          <w:b/>
-        </w:rPr>
-        <w:t>Sin clasificar</w:t>
-      </w:r>
-      <w:r>
-        <w:t xml:space="preserve"> identifica stock cuyo pago no se revisó. Tamb</w:t>
-      </w:r>
-      <w:r>
-        <w:t>ién forma parte del total general.</w:t>
+        <w:t xml:space="preserve"> las descuenta.</w:t>
       </w:r>
     </w:p>
     <w:p>
@@ -5210,7 +5254,10 @@
         <w:t>i</w:t>
       </w:r>
       <w:r>
-        <w:t xml:space="preserve"> junto a Inventario explica la relación entre stock y deuda.</w:t>
+        <w:t xml:space="preserve"> junto a Inventario explica la relac</w:t>
+      </w:r>
+      <w:r>
+        <w:t>ión entre stock y deuda.</w:t>
       </w:r>
     </w:p>
     <w:p>
@@ -5221,18 +5268,15 @@
         <w:t>Ejemplo:</w:t>
       </w:r>
       <w:r>
-        <w:t xml:space="preserve"> comprás 10 unidades a </w:t>
-      </w:r>
-      <w:r>
-        <w:t>crédito y vendés 4. Quedan 6 unidades a crédito en Stock, pero todavía debés las 10 al proveedor. La deuda se reduce al registrar su pago en Proveedores.</w:t>
-      </w:r>
-    </w:p>
-    <w:p>
-      <w:r>
-        <w:t>Las salidas consumen los ingresos más antiguos primero. Cambiar el costo actual de un producto no rees</w:t>
-      </w:r>
-      <w:r>
-        <w:t>cribe el costo guardado de los ingresos anteriores.</w:t>
+        <w:t xml:space="preserve"> comprás 10 unidades a crédito y vendés 4. Quedan 6 unidades a crédito en Stock, pero todavía debés las 10 al proveedor. La deuda se reduce al registrar su pago en Proveedores.</w:t>
+      </w:r>
+    </w:p>
+    <w:p>
+      <w:r>
+        <w:t>Las salidas consumen los ingresos más antiguos</w:t>
+      </w:r>
+      <w:r>
+        <w:t xml:space="preserve"> primero. Cambiar el costo actual de un producto no reescribe el costo guardado de los ingresos anteriores.</w:t>
       </w:r>
     </w:p>
     <w:p>
@@ -5249,7 +5293,10 @@
     </w:p>
     <w:p>
       <w:r>
-        <w:t>El stock anterior se conserva sin presumir que estaba pagado. Clasificarlo cambia su identificación de pago y conserva la cantidad física.</w:t>
+        <w:t>El stock anterior se conserva sin presumir que estaba pagado. Clasificarlo cambia su identificación de pago y conserv</w:t>
+      </w:r>
+      <w:r>
+        <w:t>a la cantidad física.</w:t>
       </w:r>
     </w:p>
     <w:p>
@@ -5270,10 +5317,7 @@
         <w:t>Stock</w:t>
       </w:r>
       <w:r>
-        <w:t>, encontrá el producto y e</w:t>
-      </w:r>
-      <w:r>
-        <w:t xml:space="preserve">legí </w:t>
+        <w:t xml:space="preserve">, encontrá el producto y elegí </w:t>
       </w:r>
       <w:r>
         <w:rPr>
@@ -5306,10 +5350,10 @@
         </w:numPr>
       </w:pPr>
       <w:r>
-        <w:t xml:space="preserve">Si ya pagaste esa mercadería, clasificala como pagada. Si la debés, seleccioná el </w:t>
-      </w:r>
-      <w:r>
-        <w:t>proveedor y la deuda anterior a la que pertenece.</w:t>
+        <w:t xml:space="preserve">Si ya pagaste esa mercadería, </w:t>
+      </w:r>
+      <w:r>
+        <w:t>clasificala como pagada. Si la debés, seleccioná el proveedor y la deuda anterior a la que pertenece.</w:t>
       </w:r>
     </w:p>
     <w:p>
@@ -5326,23 +5370,23 @@
     </w:p>
     <w:p>
       <w:r>
-        <w:t>La deuda anterior puede incluir mercadería ya vendida. Vinculá solo las unidades que todavía queda</w:t>
-      </w:r>
-      <w:r>
-        <w:t>n; no reduzcas la deuda para hacerla coincidir con ese stock.</w:t>
-      </w:r>
-    </w:p>
-    <w:p>
-      <w:r>
-        <w:t>Por ejemplo, si debés $100.000 y solo quedan unidades por $60.000 al costo, la deuda sigue siendo $100.000. Al pagarla, las unidades vinculadas que permanezcan pasan a pagadas.</w:t>
-      </w:r>
-    </w:p>
-    <w:p>
-      <w:r>
-        <w:t>Para mercadería n</w:t>
-      </w:r>
-      <w:r>
-        <w:t>ueva, registrá una compra con su condición desde Compras o Aumentar stock; no uses la clasificación para simular un nuevo ingreso.</w:t>
+        <w:t xml:space="preserve">La deuda anterior puede incluir mercadería ya </w:t>
+      </w:r>
+      <w:r>
+        <w:t>vendida. Vinculá solo las unidades que todavía quedan; no reduzcas la deuda para hacerla coincidir con ese stock.</w:t>
+      </w:r>
+    </w:p>
+    <w:p>
+      <w:r>
+        <w:t>Por ejemplo, si debés $100.000 y solo quedan unidades por $60.000 al costo, la deuda sigue siendo $100.000. Al pagarla, las unidades vinculada</w:t>
+      </w:r>
+      <w:r>
+        <w:t>s que permanezcan pasan a pagadas.</w:t>
+      </w:r>
+    </w:p>
+    <w:p>
+      <w:r>
+        <w:t>Para mercadería nueva, registrá una compra con su condición desde Compras o Aumentar stock; no uses la clasificación para simular un nuevo ingreso.</w:t>
       </w:r>
     </w:p>
     <w:p>
@@ -5359,7 +5403,10 @@
     </w:p>
     <w:p>
       <w:r>
-        <w:t>Elegí la operación según el motivo de la diferencia: mercadería recibida o corrección de inventario.</w:t>
+        <w:t>Elegí la operación según el motivo de la diferen</w:t>
+      </w:r>
+      <w:r>
+        <w:t>cia: mercadería recibida o corrección de inventario.</w:t>
       </w:r>
     </w:p>
     <w:p>
@@ -5378,7 +5425,10 @@
         <w:t>Aumentar stock</w:t>
       </w:r>
       <w:r>
-        <w:t>, disponible también en Acciones, abre la carga de una compra. Seleccioná proveedor, cantidad, costo y condición de pago. Si queda a crédito, indicá el vencimiento.</w:t>
+        <w:t>, disponible también en Acciones, abre la carga de una compra. Seleccioná proveedor, cantidad, costo y condición de pago. Si queda a crédito, indicá el vencimie</w:t>
+      </w:r>
+      <w:r>
+        <w:t>nto.</w:t>
       </w:r>
     </w:p>
     <w:p>
@@ -5404,13 +5454,7 @@
         <w:rPr>
           <w:b/>
         </w:rPr>
-        <w:t>Ajustar</w:t>
-      </w:r>
-      <w:r>
-        <w:rPr>
-          <w:b/>
-        </w:rPr>
-        <w:t xml:space="preserve"> stock</w:t>
+        <w:t>Ajustar stock</w:t>
       </w:r>
       <w:r>
         <w:t xml:space="preserve"> y seleccioná el producto.</w:t>
@@ -5455,10 +5499,10 @@
         </w:numPr>
       </w:pPr>
       <w:r>
-        <w:t>Revisá el resultado y guardá. El ajuste debe respetar las unidades reservada</w:t>
-      </w:r>
-      <w:r>
-        <w:t>s.</w:t>
+        <w:t>Revisá el resultado y gu</w:t>
+      </w:r>
+      <w:r>
+        <w:t>ardá. El ajuste debe respetar las unidades reservadas.</w:t>
       </w:r>
     </w:p>
     <w:p>
@@ -5477,10 +5521,10 @@
     </w:p>
     <w:p>
       <w:r>
-        <w:t xml:space="preserve">Los egresos descuentan los ingresos más antiguos. Para revertir un ajuste permitido, </w:t>
-      </w:r>
-      <w:r>
-        <w:t xml:space="preserve">usá </w:t>
+        <w:t>Los egresos descuentan los ingres</w:t>
+      </w:r>
+      <w:r>
+        <w:t xml:space="preserve">os más antiguos. Para revertir un ajuste permitido, usá </w:t>
       </w:r>
       <w:r>
         <w:rPr>
@@ -5494,7 +5538,10 @@
     </w:p>
     <w:p>
       <w:r>
-        <w:t>Las compras y las ventas se corrigen desde su módulo de origen. Una compra solo se anula si sus unidades originales siguen disponibles.</w:t>
+        <w:t xml:space="preserve">Las compras y las ventas se corrigen desde su módulo de origen. Una compra solo se anula si sus unidades originales siguen </w:t>
+      </w:r>
+      <w:r>
+        <w:t>disponibles.</w:t>
       </w:r>
     </w:p>
     <w:p>
@@ -5511,10 +5558,7 @@
     </w:p>
     <w:p>
       <w:r>
-        <w:t xml:space="preserve">El Historial reúne las operaciones y los </w:t>
-      </w:r>
-      <w:r>
-        <w:t>cambios para consultar qué ocurrió y cuándo.</w:t>
+        <w:t>El Historial reúne las operaciones y los cambios para consultar qué ocurrió y cuándo.</w:t>
       </w:r>
     </w:p>
     <w:p>
@@ -5527,7 +5571,7 @@
           <w:noProof/>
         </w:rPr>
         <w:drawing>
-          <wp:inline distT="0" distB="0" distL="0" distR="0" wp14:anchorId="345D9CC0" wp14:editId="06534406">
+          <wp:inline distT="0" distB="0" distL="0" distR="0" wp14:anchorId="481D0A2E" wp14:editId="1D1C71F0">
             <wp:extent cx="6309360" cy="3195795"/>
             <wp:effectExtent l="0" t="0" r="0" b="0"/>
             <wp:docPr id="20" name="Picture 20" descr="Actividades organizadas por mes y tipo de operación."/>
@@ -5599,7 +5643,10 @@
         <w:t>Meses con actividad</w:t>
       </w:r>
       <w:r>
-        <w:t>, desplegá el año y elegí el mes que querés revisar.</w:t>
+        <w:t>, desplegá el año y elegí el mes que querés revisa</w:t>
+      </w:r>
+      <w:r>
+        <w:t>r.</w:t>
       </w:r>
     </w:p>
     <w:p>
@@ -5611,10 +5658,7 @@
         </w:numPr>
       </w:pPr>
       <w:r>
-        <w:t xml:space="preserve">Usá la búsqueda para encontrar un comprobante, </w:t>
-      </w:r>
-      <w:r>
-        <w:t>producto o detalle.</w:t>
+        <w:t>Usá la búsqueda para encontrar un comprobante, producto o detalle.</w:t>
       </w:r>
     </w:p>
     <w:p>
@@ -5647,7 +5691,10 @@
         </w:numPr>
       </w:pPr>
       <w:r>
-        <w:t xml:space="preserve">Leé la fecha, el tipo y el detalle del movimiento. Usá </w:t>
+        <w:t>Leé la fecha, el tipo y el detalle del movi</w:t>
+      </w:r>
+      <w:r>
+        <w:t xml:space="preserve">miento. Usá </w:t>
       </w:r>
       <w:r>
         <w:rPr>
@@ -5656,10 +5703,7 @@
         <w:t>Ver más</w:t>
       </w:r>
       <w:r>
-        <w:t xml:space="preserve"> para ampliar el listado cuando</w:t>
-      </w:r>
-      <w:r>
-        <w:t xml:space="preserve"> esté disponible.</w:t>
+        <w:t xml:space="preserve"> para ampliar el listado cuando esté disponible.</w:t>
       </w:r>
     </w:p>
     <w:p>
@@ -5669,10 +5713,10 @@
     </w:p>
     <w:p>
       <w:r>
-        <w:t xml:space="preserve">Cuando investigues una diferencia, compará el registro del historial con el comprobante y el movimiento de </w:t>
-      </w:r>
-      <w:r>
-        <w:t>stock de esa misma operación.</w:t>
+        <w:t xml:space="preserve">Cuando investigues una diferencia, compará el registro del </w:t>
+      </w:r>
+      <w:r>
+        <w:t>historial con el comprobante y el movimiento de stock de esa misma operación.</w:t>
       </w:r>
     </w:p>
     <w:p>
@@ -5688,7 +5732,10 @@
       <w:bookmarkStart w:id="24" w:name="chapter_24"/>
       <w:r>
         <w:lastRenderedPageBreak/>
-        <w:t>Reportes y período de consulta</w:t>
+        <w:t xml:space="preserve">Reportes </w:t>
+      </w:r>
+      <w:r>
+        <w:t>y período de consulta</w:t>
       </w:r>
       <w:bookmarkEnd w:id="24"/>
     </w:p>
@@ -5703,10 +5750,7 @@
         <w:t>Período</w:t>
       </w:r>
       <w:r>
-        <w:t xml:space="preserve"> est</w:t>
-      </w:r>
-      <w:r>
-        <w:t>á en la cabecera, al lado de Exportar. Un mismo rango se aplica a los indicadores y consultas del reporte.</w:t>
+        <w:t xml:space="preserve"> está en la cabecera, al lado de Exportar. Un mismo rango se aplica a los indicadores y consultas del reporte.</w:t>
       </w:r>
     </w:p>
     <w:p>
@@ -5719,7 +5763,7 @@
           <w:noProof/>
         </w:rPr>
         <w:drawing>
-          <wp:inline distT="0" distB="0" distL="0" distR="0" wp14:anchorId="43655E97" wp14:editId="22EA9A7A">
+          <wp:inline distT="0" distB="0" distL="0" distR="0" wp14:anchorId="674BB4E4" wp14:editId="5E676B37">
             <wp:extent cx="5852160" cy="4434745"/>
             <wp:effectExtent l="0" t="0" r="0" b="0"/>
             <wp:docPr id="21" name="Picture 21" descr="Reportes y período de consulta con datos ficticios."/>
@@ -5782,10 +5826,10 @@
         <w:t>Período</w:t>
       </w:r>
       <w:r>
-        <w:t>. Elegí un atajo como Hoy, Últimos 7 días o Este mes, o marcá inicio y fin en el ca</w:t>
-      </w:r>
-      <w:r>
-        <w:t>lendario de dos meses.</w:t>
+        <w:t xml:space="preserve">. Elegí un atajo como Hoy, Últimos </w:t>
+      </w:r>
+      <w:r>
+        <w:t>7 días o Este mes, o marcá inicio y fin en el calendario de dos meses.</w:t>
       </w:r>
     </w:p>
     <w:p>
@@ -5809,10 +5853,10 @@
         </w:numPr>
       </w:pPr>
       <w:r>
-        <w:t>Revisá indicadores, gráfico, productos y combos vendidos, consumo y medios de pago. Los días se interp</w:t>
-      </w:r>
-      <w:r>
-        <w:t>retan en la zona horaria de Buenos Aires.</w:t>
+        <w:t>Revisá indicadores, gráfico, productos y combos vendid</w:t>
+      </w:r>
+      <w:r>
+        <w:t>os, consumo y medios de pago. Los días se interpretan en la zona horaria de Buenos Aires.</w:t>
       </w:r>
     </w:p>
     <w:p>
@@ -5844,15 +5888,18 @@
         <w:t>Ventas menos compras</w:t>
       </w:r>
       <w:r>
-        <w:t xml:space="preserve"> compara los importes registrados; no incluye todos los gastos del negocio ni equiv</w:t>
-      </w:r>
-      <w:r>
-        <w:t>ale a la ganancia neta. El consumo separa productos sueltos y componentes de combos sin cobrarlos nuevamente.</w:t>
-      </w:r>
-    </w:p>
-    <w:p>
-      <w:r>
-        <w:t xml:space="preserve">Los importes de ventas describen operaciones. Para conocer cobros o acreditaciones efectivos, consultá </w:t>
+        <w:t xml:space="preserve"> compara los importes registrados; </w:t>
+      </w:r>
+      <w:r>
+        <w:t>no incluye todos los gastos del negocio ni equivale a la ganancia neta. El consumo separa productos sueltos y componentes de combos sin cobrarlos nuevamente.</w:t>
+      </w:r>
+    </w:p>
+    <w:p>
+      <w:r>
+        <w:t>Los importes de ventas describen operaciones. Para conocer cobros o acreditaciones efectivos, cons</w:t>
+      </w:r>
+      <w:r>
+        <w:t xml:space="preserve">ultá </w:t>
       </w:r>
       <w:r>
         <w:rPr>
@@ -5861,10 +5908,7 @@
         <w:t>Clientes y cobranzas</w:t>
       </w:r>
       <w:r>
-        <w:t>. La tabla de precios o</w:t>
-      </w:r>
-      <w:r>
-        <w:t>riginales conserva lista, escala y condiciones de cada venta.</w:t>
+        <w:t>. La tabla de precios originales conserva lista, escala y condiciones de cada venta.</w:t>
       </w:r>
     </w:p>
     <w:p>
@@ -5894,7 +5938,7 @@
           <w:noProof/>
         </w:rPr>
         <w:drawing>
-          <wp:inline distT="0" distB="0" distL="0" distR="0" wp14:anchorId="1D350913" wp14:editId="16A9CDB6">
+          <wp:inline distT="0" distB="0" distL="0" distR="0" wp14:anchorId="4088F565" wp14:editId="613B0A6B">
             <wp:extent cx="6309360" cy="3363995"/>
             <wp:effectExtent l="0" t="0" r="0" b="0"/>
             <wp:docPr id="22" name="Picture 22" descr="Configuración del modo de color y de la escala."/>
@@ -5975,13 +6019,7 @@
         <w:rPr>
           <w:b/>
         </w:rPr>
-        <w:t xml:space="preserve">Tema de </w:t>
-      </w:r>
-      <w:r>
-        <w:rPr>
-          <w:b/>
-        </w:rPr>
-        <w:t>la interfaz</w:t>
+        <w:t>Tema de la interfaz</w:t>
       </w:r>
       <w:r>
         <w:t xml:space="preserve">, elegí </w:t>
@@ -6044,7 +6082,10 @@
         </w:numPr>
       </w:pPr>
       <w:r>
-        <w:t xml:space="preserve">Presioná </w:t>
+        <w:t>Presioná</w:t>
+      </w:r>
+      <w:r>
+        <w:t xml:space="preserve"> </w:t>
       </w:r>
       <w:r>
         <w:rPr>
@@ -6053,7 +6094,23 @@
         <w:t>Restablecer</w:t>
       </w:r>
       <w:r>
-        <w:t xml:space="preserve"> si querés volver al tamaño de 100 %</w:t>
+        <w:t xml:space="preserve"> si querés volver al tamaño de 100 %.</w:t>
+      </w:r>
+    </w:p>
+    <w:p>
+      <w:r>
+        <w:t>El tema y la escala se guardan automáticamente en ese navegador. Si usás otro navegador, sus preferencias de apariencia pueden ser distintas.</w:t>
+      </w:r>
+    </w:p>
+    <w:p>
+      <w:r>
+        <w:t xml:space="preserve">El acceso rápido para cambiar entre claro y oscuro se muestra únicamente en el Dashboard. Desde los demás módulos, entrá en </w:t>
+      </w:r>
+      <w:r>
+        <w:rPr>
+          <w:b/>
+        </w:rPr>
+        <w:t>Configuración &gt; Apariencia</w:t>
       </w:r>
       <w:r>
         <w:t>.</w:t>
@@ -6061,29 +6118,10 @@
     </w:p>
     <w:p>
       <w:r>
-        <w:t>El tema y la escala se guardan automáticamente en ese navegador. Si usás otro navegador, sus preferencias de apariencia pueden ser distintas.</w:t>
-      </w:r>
-    </w:p>
-    <w:p>
-      <w:r>
-        <w:t>El acceso rápido para cambiar entre claro y oscuro se muestra únicamente en el Dashboard. Desde los demás módulo</w:t>
-      </w:r>
-      <w:r>
-        <w:t xml:space="preserve">s, entrá en </w:t>
-      </w:r>
-      <w:r>
-        <w:rPr>
-          <w:b/>
-        </w:rPr>
-        <w:t>Configuración &gt; Apariencia</w:t>
-      </w:r>
-      <w:r>
-        <w:t>.</w:t>
-      </w:r>
-    </w:p>
-    <w:p>
-      <w:r>
-        <w:t>Si necesitás más espacio para trabajar, reducí la escala gradualmente. Si la lectura resulta pequeña, aumentala o restablecé el tamaño inicial.</w:t>
+        <w:t>Si necesitás más espacio para trabajar, reducí la escala gradualmente. Si la lectura resulta pequeña, au</w:t>
+      </w:r>
+      <w:r>
+        <w:t>mentala o restablecé el tamaño inicial.</w:t>
       </w:r>
     </w:p>
     <w:p>
@@ -6122,7 +6160,7 @@
           <w:noProof/>
         </w:rPr>
         <w:drawing>
-          <wp:inline distT="0" distB="0" distL="0" distR="0" wp14:anchorId="0B456E40" wp14:editId="01A34A65">
+          <wp:inline distT="0" distB="0" distL="0" distR="0" wp14:anchorId="310B85D6" wp14:editId="221A29DA">
             <wp:extent cx="6309360" cy="3363995"/>
             <wp:effectExtent l="0" t="0" r="0" b="0"/>
             <wp:docPr id="23" name="Picture 23" descr="Pagos y cupones con datos ficticios."/>
@@ -6312,7 +6350,7 @@
           <w:noProof/>
         </w:rPr>
         <w:drawing>
-          <wp:inline distT="0" distB="0" distL="0" distR="0" wp14:anchorId="7069C08E" wp14:editId="240D0CD0">
+          <wp:inline distT="0" distB="0" distL="0" distR="0" wp14:anchorId="60C45221" wp14:editId="668FB632">
             <wp:extent cx="6309360" cy="3363995"/>
             <wp:effectExtent l="0" t="0" r="0" b="0"/>
             <wp:docPr id="24" name="Picture 24" descr="Comprobantes e impresión con datos ficticios."/>
@@ -6586,10 +6624,10 @@
         </w:numPr>
       </w:pPr>
       <w:r>
-        <w:t>Copiá el archivo generado a una unidad ext</w:t>
-      </w:r>
-      <w:r>
-        <w:t>erna o una carpeta de respaldo que mantengas fuera del equipo.</w:t>
+        <w:t xml:space="preserve">Copiá el archivo generado a una </w:t>
+      </w:r>
+      <w:r>
+        <w:t>unidad externa o una carpeta de respaldo que mantengas fuera del equipo.</w:t>
       </w:r>
     </w:p>
     <w:p>
@@ -6611,15 +6649,15 @@
         <w:t>Backup automático diario</w:t>
       </w:r>
       <w:r>
-        <w:t xml:space="preserve"> en la misma sección. El sistema crea una copia al cumplirse 24 horas desde el último backup, mientras está en ejecución. Si estaba cerrado, realiza la copia pendiente al volver a abrirlo.</w:t>
-      </w:r>
-    </w:p>
-    <w:p>
-      <w:r>
-        <w:t xml:space="preserve">Antes de importar datos o actualizar la aplicación, creá una copia </w:t>
-      </w:r>
-      <w:r>
-        <w:t>manual y comprobá que el archivo exista.</w:t>
+        <w:t xml:space="preserve"> en la misma sección. El sistema crea una copia al cumplirse 24 horas desde el último backup, mientras está en ejecución. Si es</w:t>
+      </w:r>
+      <w:r>
+        <w:t>taba cerrado, realiza la copia pendiente al volver a abrirlo.</w:t>
+      </w:r>
+    </w:p>
+    <w:p>
+      <w:r>
+        <w:t>Antes de importar datos o actualizar la aplicación, creá una copia manual y comprobá que el archivo exista.</w:t>
       </w:r>
     </w:p>
     <w:p>
@@ -6638,7 +6676,13 @@
         <w:rPr>
           <w:b/>
         </w:rPr>
-        <w:t>Windows + R</w:t>
+        <w:t>Wind</w:t>
+      </w:r>
+      <w:r>
+        <w:rPr>
+          <w:b/>
+        </w:rPr>
+        <w:t>ows + R</w:t>
       </w:r>
       <w:r>
         <w:t xml:space="preserve">, escribí </w:t>
@@ -6706,15 +6750,15 @@
     </w:p>
     <w:p>
       <w:r>
-        <w:t>Usá las opciones del sistema para generar y restaurar copias. No reemplaces manualmente la base mientras la aplicación está abierta.</w:t>
-      </w:r>
-    </w:p>
-    <w:p>
-      <w:r>
-        <w:t>La desinstalación conserva la carpeta</w:t>
-      </w:r>
-      <w:r>
-        <w:t xml:space="preserve"> de datos del usuario. Un respaldo guardado únicamente en esa misma computadora no protege frente a una falla del disco.</w:t>
+        <w:t>Usá las opciones del sistema para generar y restaurar copias. No</w:t>
+      </w:r>
+      <w:r>
+        <w:t xml:space="preserve"> reemplaces manualmente la base mientras la aplicación está abierta.</w:t>
+      </w:r>
+    </w:p>
+    <w:p>
+      <w:r>
+        <w:t>La desinstalación conserva la carpeta de datos del usuario. Un respaldo guardado únicamente en esa misma computadora no protege frente a una falla del disco.</w:t>
       </w:r>
     </w:p>
     <w:p>
@@ -6731,10 +6775,10 @@
     </w:p>
     <w:p>
       <w:r>
-        <w:t>Usá CSV para consultar o compartir registros en una planilla. Para recuperar el sistema completo necesitás un respal</w:t>
-      </w:r>
-      <w:r>
-        <w:t>do SQLite.</w:t>
+        <w:t>Usá CSV pa</w:t>
+      </w:r>
+      <w:r>
+        <w:t>ra consultar o compartir registros en una planilla. Para recuperar el sistema completo necesitás un respaldo SQLite.</w:t>
       </w:r>
     </w:p>
     <w:p>
@@ -6747,7 +6791,7 @@
           <w:noProof/>
         </w:rPr>
         <w:drawing>
-          <wp:inline distT="0" distB="0" distL="0" distR="0" wp14:anchorId="23B144EE" wp14:editId="62AE2F3B">
+          <wp:inline distT="0" distB="0" distL="0" distR="0" wp14:anchorId="324D7FD2" wp14:editId="622D6517">
             <wp:extent cx="6309360" cy="3252941"/>
             <wp:effectExtent l="0" t="0" r="0" b="0"/>
             <wp:docPr id="25" name="Picture 25" descr="Exportar planillas con datos ficticios."/>
@@ -6831,10 +6875,10 @@
         <w:t>Exportar CSV</w:t>
       </w:r>
       <w:r>
-        <w:t xml:space="preserve"> y guardá el archivo. Las 33 opciones incluyen registros archivados y movimientos revertidos, identificados con su</w:t>
-      </w:r>
-      <w:r>
-        <w:t xml:space="preserve"> estado.</w:t>
+        <w:t xml:space="preserve"> y guard</w:t>
+      </w:r>
+      <w:r>
+        <w:t>á el archivo. Las 33 opciones incluyen registros archivados y movimientos revertidos, identificados con su estado.</w:t>
       </w:r>
     </w:p>
     <w:p>
@@ -7082,7 +7126,13 @@
               <w:rPr>
                 <w:sz w:val="19"/>
               </w:rPr>
-              <w:t>Stock y precios</w:t>
+              <w:t xml:space="preserve">Stock y </w:t>
+            </w:r>
+            <w:r>
+              <w:rPr>
+                <w:sz w:val="19"/>
+              </w:rPr>
+              <w:t>precios</w:t>
             </w:r>
           </w:p>
         </w:tc>
@@ -7146,10 +7196,10 @@
     </w:p>
     <w:p>
       <w:r>
-        <w:t>La importación reemplaza los datos actuales por los del respald</w:t>
-      </w:r>
-      <w:r>
-        <w:t>o validado. Revisá el archivo y sus cantidades antes de confirmar.</w:t>
+        <w:t>La importación reemplaza los datos actuales por los del respaldo validado. Revisá el archivo y sus cantidades ant</w:t>
+      </w:r>
+      <w:r>
+        <w:t>es de confirmar.</w:t>
       </w:r>
     </w:p>
     <w:p>
@@ -7221,10 +7271,10 @@
         </w:numPr>
       </w:pPr>
       <w:r>
-        <w:t xml:space="preserve">Revisá el </w:t>
-      </w:r>
-      <w:r>
-        <w:t>resumen de catálogo, ventas, cobranzas, tarjetas, proveedores, stock por origen y listas de precios. Podés cancelar antes de reemplazar.</w:t>
+        <w:t xml:space="preserve">Revisá el resumen de catálogo, ventas, cobranzas, tarjetas, </w:t>
+      </w:r>
+      <w:r>
+        <w:t>proveedores, stock por origen y listas de precios. Podés cancelar antes de reemplazar.</w:t>
       </w:r>
     </w:p>
     <w:p>
@@ -7259,15 +7309,18 @@
     </w:p>
     <w:p>
       <w:r>
-        <w:t>Los respaldos antiguos compatibles se actualizan en una copia temporal y se validan antes de usarse. La importación conserva los registros financieros, sus relaciones e importes.</w:t>
-      </w:r>
-    </w:p>
-    <w:p>
-      <w:r>
-        <w:t>Antes del reemplazo se crea una copia de la base actual. Si no se puede crear</w:t>
-      </w:r>
-      <w:r>
-        <w:t xml:space="preserve"> o falla el reemplazo, los datos actuales se conservan. No cierres el programa durante el proceso.</w:t>
+        <w:t>Los respaldos antiguos compatibles se actualizan e</w:t>
+      </w:r>
+      <w:r>
+        <w:t>n una copia temporal y se validan antes de usarse. La importación conserva los registros financieros, sus relaciones e importes.</w:t>
+      </w:r>
+    </w:p>
+    <w:p>
+      <w:r>
+        <w:t>Antes del reemplazo se crea una copia de la base actual. Si no se puede crear o falla el reemplazo, los datos actuales se conse</w:t>
+      </w:r>
+      <w:r>
+        <w:t>rvan. No cierres el programa durante el proceso.</w:t>
       </w:r>
     </w:p>
     <w:p>
@@ -7289,10 +7342,10 @@
     </w:p>
     <w:p>
       <w:r>
-        <w:t>Revisá tant</w:t>
-      </w:r>
-      <w:r>
-        <w:t>o la mercadería como los compromisos de cobro y pago al comenzar y cerrar la jornada.</w:t>
+        <w:t>Revisá tanto la mercadería como los compromisos de cobro y pa</w:t>
+      </w:r>
+      <w:r>
+        <w:t>go al comenzar y cerrar la jornada.</w:t>
       </w:r>
     </w:p>
     <w:p>
@@ -7308,10 +7361,7 @@
         <w:pStyle w:val="ManualBullet"/>
       </w:pPr>
       <w:r>
-        <w:t>•  En Clientes y cobranzas, controlá cuotas atrasadas y tarjetas pendientes. En Proveedores, revisá</w:t>
-      </w:r>
-      <w:r>
-        <w:t xml:space="preserve"> vencimientos.</w:t>
+        <w:t>•  En Clientes y cobranzas, controlá cuotas atrasadas y tarjetas pendientes. En Proveedores, revisá vencimientos.</w:t>
       </w:r>
     </w:p>
     <w:p>
@@ -7319,7 +7369,10 @@
         <w:pStyle w:val="ManualBullet"/>
       </w:pPr>
       <w:r>
-        <w:t>•  Registrá compras, ventas, cobros y pagos según la fecha efectiva. Al cerrar, revisá los movimientos y creá un respaldo.</w:t>
+        <w:t>•  Registrá compras, ventas, cobros</w:t>
+      </w:r>
+      <w:r>
+        <w:t xml:space="preserve"> y pagos según la fecha efectiva. Al cerrar, revisá los movimientos y creá un respaldo.</w:t>
       </w:r>
     </w:p>
     <w:p>
@@ -7338,18 +7391,21 @@
         <w:t>Cobrar está deshabilitado.</w:t>
       </w:r>
       <w:r>
-        <w:t xml:space="preserve"> El cliente no tiene deuda directa pendiente. Si compró con tarjeta, </w:t>
-      </w:r>
-      <w:r>
-        <w:t>buscá la operación en Tarjetas.</w:t>
-      </w:r>
-    </w:p>
-    <w:p>
-      <w:r>
-        <w:rPr>
-          <w:b/>
-        </w:rPr>
-        <w:t>No cambia el precio mayorista.</w:t>
+        <w:t xml:space="preserve"> El cliente no tiene deuda directa pendiente. Si compró con tarjeta, buscá la operación en Tarjetas.</w:t>
+      </w:r>
+    </w:p>
+    <w:p>
+      <w:r>
+        <w:rPr>
+          <w:b/>
+        </w:rPr>
+        <w:t>No cambia el preci</w:t>
+      </w:r>
+      <w:r>
+        <w:rPr>
+          <w:b/>
+        </w:rPr>
+        <w:t>o mayorista.</w:t>
       </w:r>
       <w:r>
         <w:t xml:space="preserve"> Revisá cliente, lista asignada, unidades combinadas, escala y precios guardados. Una celda vacía puede conservar un precio anterior o el habitual.</w:t>
@@ -7363,10 +7419,10 @@
         <w:t>No puedo confirmar una venta.</w:t>
       </w:r>
       <w:r>
-        <w:t xml:space="preserve"> Leé la indicació</w:t>
-      </w:r>
-      <w:r>
-        <w:t>n junto al botón. Completá cliente, calendario o dinero recibido cuando corresponda y esperá el recálculo.</w:t>
+        <w:t xml:space="preserve"> Leé la indicación junto al botón. Completá cliente, calendario o d</w:t>
+      </w:r>
+      <w:r>
+        <w:t>inero recibido cuando corresponda y esperá el recálculo.</w:t>
       </w:r>
     </w:p>
     <w:p>
@@ -7377,10 +7433,10 @@
         <w:t>La aplicación no abre.</w:t>
       </w:r>
       <w:r>
-        <w:t xml:space="preserve"> Iniciá desde el acceso directo y revisá el ícono junto al reloj. Al pedir ayuda, indicá si falla el instalador, el inicio del </w:t>
-      </w:r>
-      <w:r>
-        <w:t>programa o la carga del navegador, y copiá el mensaje exacto.</w:t>
+        <w:t xml:space="preserve"> Iniciá desde el acceso directo y revisá el ícono junto al reloj. Al pedir ayuda, indicá si falla el instalador, el inicio del programa o la carga del navegador, y copiá el mens</w:t>
+      </w:r>
+      <w:r>
+        <w:t>aje exacto.</w:t>
       </w:r>
     </w:p>
     <w:p>
@@ -7391,10 +7447,7 @@
         <w:t>Para solicitar asistencia</w:t>
       </w:r>
       <w:r>
-        <w:t>, informá versión, pantalla, pasos, fecha y comprobante. Conservá el backup y los registros de la carpeta logs. Si una ventana no entra en pantalla, restablecé la escala</w:t>
-      </w:r>
-      <w:r>
-        <w:t xml:space="preserve"> al 100 %.</w:t>
+        <w:t>, informá versión, pantalla, pasos, fecha y comprobante. Conservá el backup y los registros de la carpeta logs. Si una ventana no entra en pantalla, restablecé la escala al 100 %.</w:t>
       </w:r>
     </w:p>
     <w:sectPr>
@@ -7697,7 +7750,7 @@
   <w:abstractNum w:abstractNumId="6" w15:restartNumberingAfterBreak="0">
     <w:nsid w:val="00000019"/>
     <w:multiLevelType w:val="singleLevel"/>
-    <w:tmpl w:val="662AE572"/>
+    <w:tmpl w:val="ED987C1E"/>
     <w:lvl w:ilvl="0">
       <w:start w:val="1"/>
       <w:numFmt w:val="decimal"/>
@@ -7714,7 +7767,7 @@
   <w:abstractNum w:abstractNumId="7" w15:restartNumberingAfterBreak="0">
     <w:nsid w:val="0000001A"/>
     <w:multiLevelType w:val="singleLevel"/>
-    <w:tmpl w:val="F1E0BC72"/>
+    <w:tmpl w:val="EB5846D6"/>
     <w:lvl w:ilvl="0">
       <w:start w:val="1"/>
       <w:numFmt w:val="decimal"/>
@@ -7731,7 +7784,7 @@
   <w:abstractNum w:abstractNumId="8" w15:restartNumberingAfterBreak="0">
     <w:nsid w:val="0000001B"/>
     <w:multiLevelType w:val="singleLevel"/>
-    <w:tmpl w:val="13FE7B6A"/>
+    <w:tmpl w:val="0652F290"/>
     <w:lvl w:ilvl="0">
       <w:start w:val="1"/>
       <w:numFmt w:val="decimal"/>
@@ -7748,7 +7801,7 @@
   <w:abstractNum w:abstractNumId="9" w15:restartNumberingAfterBreak="0">
     <w:nsid w:val="0000001C"/>
     <w:multiLevelType w:val="singleLevel"/>
-    <w:tmpl w:val="06D2E3F4"/>
+    <w:tmpl w:val="2E68CE30"/>
     <w:lvl w:ilvl="0">
       <w:start w:val="1"/>
       <w:numFmt w:val="decimal"/>
@@ -7765,7 +7818,7 @@
   <w:abstractNum w:abstractNumId="10" w15:restartNumberingAfterBreak="0">
     <w:nsid w:val="0000001D"/>
     <w:multiLevelType w:val="singleLevel"/>
-    <w:tmpl w:val="AA422B58"/>
+    <w:tmpl w:val="A2BEFF42"/>
     <w:lvl w:ilvl="0">
       <w:start w:val="1"/>
       <w:numFmt w:val="decimal"/>
@@ -7782,7 +7835,7 @@
   <w:abstractNum w:abstractNumId="11" w15:restartNumberingAfterBreak="0">
     <w:nsid w:val="0000001E"/>
     <w:multiLevelType w:val="singleLevel"/>
-    <w:tmpl w:val="2BD050AA"/>
+    <w:tmpl w:val="0CA2162C"/>
     <w:lvl w:ilvl="0">
       <w:start w:val="1"/>
       <w:numFmt w:val="decimal"/>
@@ -7799,7 +7852,7 @@
   <w:abstractNum w:abstractNumId="12" w15:restartNumberingAfterBreak="0">
     <w:nsid w:val="0000001F"/>
     <w:multiLevelType w:val="singleLevel"/>
-    <w:tmpl w:val="E47ACCEE"/>
+    <w:tmpl w:val="097C5000"/>
     <w:lvl w:ilvl="0">
       <w:start w:val="1"/>
       <w:numFmt w:val="decimal"/>
@@ -7816,7 +7869,7 @@
   <w:abstractNum w:abstractNumId="13" w15:restartNumberingAfterBreak="0">
     <w:nsid w:val="00000020"/>
     <w:multiLevelType w:val="singleLevel"/>
-    <w:tmpl w:val="8230F022"/>
+    <w:tmpl w:val="7C20612C"/>
     <w:lvl w:ilvl="0">
       <w:start w:val="1"/>
       <w:numFmt w:val="decimal"/>
@@ -7833,7 +7886,7 @@
   <w:abstractNum w:abstractNumId="14" w15:restartNumberingAfterBreak="0">
     <w:nsid w:val="00000021"/>
     <w:multiLevelType w:val="singleLevel"/>
-    <w:tmpl w:val="FEA216B0"/>
+    <w:tmpl w:val="72E2C4EC"/>
     <w:lvl w:ilvl="0">
       <w:start w:val="1"/>
       <w:numFmt w:val="decimal"/>
@@ -7850,7 +7903,7 @@
   <w:abstractNum w:abstractNumId="15" w15:restartNumberingAfterBreak="0">
     <w:nsid w:val="00000022"/>
     <w:multiLevelType w:val="singleLevel"/>
-    <w:tmpl w:val="ACEA2994"/>
+    <w:tmpl w:val="1A2A30D2"/>
     <w:lvl w:ilvl="0">
       <w:start w:val="1"/>
       <w:numFmt w:val="decimal"/>
@@ -7867,7 +7920,7 @@
   <w:abstractNum w:abstractNumId="16" w15:restartNumberingAfterBreak="0">
     <w:nsid w:val="00000023"/>
     <w:multiLevelType w:val="singleLevel"/>
-    <w:tmpl w:val="8188B288"/>
+    <w:tmpl w:val="7036403C"/>
     <w:lvl w:ilvl="0">
       <w:start w:val="1"/>
       <w:numFmt w:val="decimal"/>
@@ -7884,7 +7937,7 @@
   <w:abstractNum w:abstractNumId="17" w15:restartNumberingAfterBreak="0">
     <w:nsid w:val="00000024"/>
     <w:multiLevelType w:val="singleLevel"/>
-    <w:tmpl w:val="A70AAF84"/>
+    <w:tmpl w:val="B85E8030"/>
     <w:lvl w:ilvl="0">
       <w:start w:val="1"/>
       <w:numFmt w:val="decimal"/>
@@ -7901,7 +7954,7 @@
   <w:abstractNum w:abstractNumId="18" w15:restartNumberingAfterBreak="0">
     <w:nsid w:val="00000025"/>
     <w:multiLevelType w:val="singleLevel"/>
-    <w:tmpl w:val="F5322C0C"/>
+    <w:tmpl w:val="24A8AEC0"/>
     <w:lvl w:ilvl="0">
       <w:start w:val="1"/>
       <w:numFmt w:val="decimal"/>
@@ -7918,7 +7971,7 @@
   <w:abstractNum w:abstractNumId="19" w15:restartNumberingAfterBreak="0">
     <w:nsid w:val="00000026"/>
     <w:multiLevelType w:val="singleLevel"/>
-    <w:tmpl w:val="1BD40710"/>
+    <w:tmpl w:val="A6DCE51E"/>
     <w:lvl w:ilvl="0">
       <w:start w:val="1"/>
       <w:numFmt w:val="decimal"/>
@@ -7935,7 +7988,7 @@
   <w:abstractNum w:abstractNumId="20" w15:restartNumberingAfterBreak="0">
     <w:nsid w:val="00000027"/>
     <w:multiLevelType w:val="singleLevel"/>
-    <w:tmpl w:val="3836C146"/>
+    <w:tmpl w:val="50C621BE"/>
     <w:lvl w:ilvl="0">
       <w:start w:val="1"/>
       <w:numFmt w:val="decimal"/>
@@ -7952,7 +8005,7 @@
   <w:abstractNum w:abstractNumId="21" w15:restartNumberingAfterBreak="0">
     <w:nsid w:val="00000028"/>
     <w:multiLevelType w:val="singleLevel"/>
-    <w:tmpl w:val="3B1C245C"/>
+    <w:tmpl w:val="D17E5AB4"/>
     <w:lvl w:ilvl="0">
       <w:start w:val="1"/>
       <w:numFmt w:val="decimal"/>
@@ -7969,7 +8022,7 @@
   <w:abstractNum w:abstractNumId="22" w15:restartNumberingAfterBreak="0">
     <w:nsid w:val="00000029"/>
     <w:multiLevelType w:val="singleLevel"/>
-    <w:tmpl w:val="2E6C53DE"/>
+    <w:tmpl w:val="2458CC7C"/>
     <w:lvl w:ilvl="0">
       <w:start w:val="1"/>
       <w:numFmt w:val="decimal"/>
@@ -7986,7 +8039,7 @@
   <w:abstractNum w:abstractNumId="23" w15:restartNumberingAfterBreak="0">
     <w:nsid w:val="0000002A"/>
     <w:multiLevelType w:val="singleLevel"/>
-    <w:tmpl w:val="EDA20764"/>
+    <w:tmpl w:val="709EB988"/>
     <w:lvl w:ilvl="0">
       <w:start w:val="1"/>
       <w:numFmt w:val="decimal"/>
@@ -8003,7 +8056,7 @@
   <w:abstractNum w:abstractNumId="24" w15:restartNumberingAfterBreak="0">
     <w:nsid w:val="0000002B"/>
     <w:multiLevelType w:val="singleLevel"/>
-    <w:tmpl w:val="E15E5446"/>
+    <w:tmpl w:val="2DD6C95C"/>
     <w:lvl w:ilvl="0">
       <w:start w:val="1"/>
       <w:numFmt w:val="decimal"/>
@@ -8020,7 +8073,7 @@
   <w:abstractNum w:abstractNumId="25" w15:restartNumberingAfterBreak="0">
     <w:nsid w:val="0000002C"/>
     <w:multiLevelType w:val="singleLevel"/>
-    <w:tmpl w:val="787C8CE6"/>
+    <w:tmpl w:val="5AF6F7D6"/>
     <w:lvl w:ilvl="0">
       <w:start w:val="1"/>
       <w:numFmt w:val="decimal"/>
@@ -8037,7 +8090,7 @@
   <w:abstractNum w:abstractNumId="26" w15:restartNumberingAfterBreak="0">
     <w:nsid w:val="0000002D"/>
     <w:multiLevelType w:val="singleLevel"/>
-    <w:tmpl w:val="C3146A80"/>
+    <w:tmpl w:val="84B0D2EC"/>
     <w:lvl w:ilvl="0">
       <w:start w:val="1"/>
       <w:numFmt w:val="decimal"/>
@@ -8054,7 +8107,7 @@
   <w:abstractNum w:abstractNumId="27" w15:restartNumberingAfterBreak="0">
     <w:nsid w:val="0000002E"/>
     <w:multiLevelType w:val="singleLevel"/>
-    <w:tmpl w:val="411AD9DE"/>
+    <w:tmpl w:val="4208B372"/>
     <w:lvl w:ilvl="0">
       <w:start w:val="1"/>
       <w:numFmt w:val="decimal"/>
@@ -8071,7 +8124,7 @@
   <w:abstractNum w:abstractNumId="28" w15:restartNumberingAfterBreak="0">
     <w:nsid w:val="0000002F"/>
     <w:multiLevelType w:val="singleLevel"/>
-    <w:tmpl w:val="BDB8B686"/>
+    <w:tmpl w:val="A22C05EC"/>
     <w:lvl w:ilvl="0">
       <w:start w:val="1"/>
       <w:numFmt w:val="decimal"/>
@@ -8088,7 +8141,7 @@
   <w:abstractNum w:abstractNumId="29" w15:restartNumberingAfterBreak="0">
     <w:nsid w:val="00000030"/>
     <w:multiLevelType w:val="singleLevel"/>
-    <w:tmpl w:val="C5A03354"/>
+    <w:tmpl w:val="6EB69594"/>
     <w:lvl w:ilvl="0">
       <w:start w:val="1"/>
       <w:numFmt w:val="decimal"/>
@@ -8105,7 +8158,7 @@
   <w:abstractNum w:abstractNumId="30" w15:restartNumberingAfterBreak="0">
     <w:nsid w:val="00000031"/>
     <w:multiLevelType w:val="singleLevel"/>
-    <w:tmpl w:val="88C2EA8E"/>
+    <w:tmpl w:val="C108E578"/>
     <w:lvl w:ilvl="0">
       <w:start w:val="1"/>
       <w:numFmt w:val="decimal"/>
@@ -8122,7 +8175,7 @@
   <w:abstractNum w:abstractNumId="31" w15:restartNumberingAfterBreak="0">
     <w:nsid w:val="00000032"/>
     <w:multiLevelType w:val="singleLevel"/>
-    <w:tmpl w:val="DCC626D6"/>
+    <w:tmpl w:val="DB8C395A"/>
     <w:lvl w:ilvl="0">
       <w:start w:val="1"/>
       <w:numFmt w:val="decimal"/>
@@ -8139,7 +8192,7 @@
   <w:abstractNum w:abstractNumId="32" w15:restartNumberingAfterBreak="0">
     <w:nsid w:val="00000033"/>
     <w:multiLevelType w:val="singleLevel"/>
-    <w:tmpl w:val="297A9F76"/>
+    <w:tmpl w:val="C4AEDDD8"/>
     <w:lvl w:ilvl="0">
       <w:start w:val="1"/>
       <w:numFmt w:val="decimal"/>

</xml_diff>